<commit_message>
post-v1.0.15 dev bump: VERSION 1.0.16/17; §11.4.99 (Latest-Source Documentation Cross-Reference Mandate from constitution 9e3bcc5) short-form propagated to Constitution.md / CLAUDE.md / AGENTS.md / QWEN.md (3 occurrences each, well above gate min 2); verify.sh L1C gate loop extended to cover 87..99; constitution submodule pointer advanced 6828ff2 → 9e3bcc5 (includes codegraph cadence auto-log + §11.4.99). Mistborn re-verify GREEN PASS=45/0/SKIP=3 (post-release run).
Signed-off-by: Milos Vasic <i@mvasic.ru>
</commit_message>
<xml_diff>
--- a/AGENTS.docx
+++ b/AGENTS.docx
@@ -10,7 +10,7 @@
         <w:t xml:space="preserve">AGENTS</w:t>
       </w:r>
     </w:p>
-    <w:bookmarkStart w:id="33" w:name="vasic-digital-tmux--agentsmd"/>
+    <w:bookmarkStart w:id="34" w:name="vasic-digital-tmux--agentsmd"/>
     <w:p>
       <w:pPr>
         <w:pStyle w:val="Heading1"/>
@@ -2298,7 +2298,7 @@
       </w:r>
     </w:p>
     <w:bookmarkEnd w:id="19"/>
-    <w:bookmarkStart w:id="32" w:name="X503db2381440baa22bc246b08437cf66873e1ff"/>
+    <w:bookmarkStart w:id="33" w:name="X503db2381440baa22bc246b08437cf66873e1ff"/>
     <w:p>
       <w:pPr>
         <w:pStyle w:val="Heading2"/>
@@ -3620,8 +3620,147 @@
       </w:r>
     </w:p>
     <w:bookmarkEnd w:id="31"/>
+    <w:bookmarkStart w:id="32" w:name="X9e3bf6e3065cf8b59298db9cec2d5f1bf9a288e"/>
+    <w:p>
+      <w:pPr>
+        <w:pStyle w:val="Heading3"/>
+      </w:pPr>
+      <w:r>
+        <w:t xml:space="preserve">§11.4.99 — Latest-Source Documentation Cross-Reference Mandate</w:t>
+      </w:r>
+    </w:p>
+    <w:p>
+      <w:pPr>
+        <w:pStyle w:val="FirstParagraph"/>
+      </w:pPr>
+      <w:r>
+        <w:t xml:space="preserve">Inherited from</w:t>
+      </w:r>
+      <w:r>
+        <w:t xml:space="preserve"> </w:t>
+      </w:r>
+      <w:r>
+        <w:rPr>
+          <w:rStyle w:val="VerbatimChar"/>
+        </w:rPr>
+        <w:t xml:space="preserve">constitution/Constitution.md</w:t>
+      </w:r>
+      <w:r>
+        <w:t xml:space="preserve"> </w:t>
+      </w:r>
+      <w:r>
+        <w:t xml:space="preserve">§11.4.99 (commit</w:t>
+      </w:r>
+      <w:r>
+        <w:t xml:space="preserve"> </w:t>
+      </w:r>
+      <w:r>
+        <w:rPr>
+          <w:rStyle w:val="VerbatimChar"/>
+        </w:rPr>
+        <w:t xml:space="preserve">9e3bcc5</w:t>
+      </w:r>
+      <w:r>
+        <w:t xml:space="preserve"> </w:t>
+      </w:r>
+      <w:r>
+        <w:t xml:space="preserve">ff 2026-05-28). Before committing operator-facing instruction docs</w:t>
+      </w:r>
+      <w:r>
+        <w:t xml:space="preserve"> </w:t>
+      </w:r>
+      <w:r>
+        <w:t xml:space="preserve">(guides, manuals, setup walkthroughs, troubleshooting cookbooks, API</w:t>
+      </w:r>
+      <w:r>
+        <w:t xml:space="preserve"> </w:t>
+      </w:r>
+      <w:r>
+        <w:t xml:space="preserve">how-tos), fetch LATEST official online docs via WebFetch / MCP / direct</w:t>
+      </w:r>
+      <w:r>
+        <w:t xml:space="preserve"> </w:t>
+      </w:r>
+      <w:r>
+        <w:t xml:space="preserve">browsing (NOT training data). Cross-reference every instruction.</w:t>
+      </w:r>
+      <w:r>
+        <w:t xml:space="preserve"> </w:t>
+      </w:r>
+      <w:r>
+        <w:rPr>
+          <w:rStyle w:val="VerbatimChar"/>
+        </w:rPr>
+        <w:t xml:space="preserve">## Sources verified &lt;date&gt;</w:t>
+      </w:r>
+      <w:r>
+        <w:t xml:space="preserve"> </w:t>
+      </w:r>
+      <w:r>
+        <w:t xml:space="preserve">section in doc +</w:t>
+      </w:r>
+      <w:r>
+        <w:t xml:space="preserve"> </w:t>
+      </w:r>
+      <w:r>
+        <w:rPr>
+          <w:rStyle w:val="VerbatimChar"/>
+        </w:rPr>
+        <w:t xml:space="preserve">Sources verified &lt;date&gt;: &lt;urls&gt;</w:t>
+      </w:r>
+      <w:r>
+        <w:t xml:space="preserve"> </w:t>
+      </w:r>
+      <w:r>
+        <w:t xml:space="preserve">footer in commit message MANDATORY. Re-verification cadence:</w:t>
+      </w:r>
+      <w:r>
+        <w:t xml:space="preserve"> </w:t>
+      </w:r>
+      <w:r>
+        <w:t xml:space="preserve">≤6 mo general; ≤90 d for risk-classified (messengers, cloud, payments,</w:t>
+      </w:r>
+      <w:r>
+        <w:t xml:space="preserve"> </w:t>
+      </w:r>
+      <w:r>
+        <w:t xml:space="preserve">LLM, code-host, package mgrs). Stale → §11.4.90 Obsolete after 30-day</w:t>
+      </w:r>
+      <w:r>
+        <w:t xml:space="preserve"> </w:t>
+      </w:r>
+      <w:r>
+        <w:t xml:space="preserve">grace.</w:t>
+      </w:r>
+      <w:r>
+        <w:t xml:space="preserve"> </w:t>
+      </w:r>
+      <w:r>
+        <w:rPr>
+          <w:b/>
+          <w:bCs/>
+        </w:rPr>
+        <w:t xml:space="preserve">Canonical authority:</w:t>
+      </w:r>
+      <w:r>
+        <w:t xml:space="preserve"> </w:t>
+      </w:r>
+      <w:r>
+        <w:rPr>
+          <w:rStyle w:val="VerbatimChar"/>
+        </w:rPr>
+        <w:t xml:space="preserve">constitution/Constitution.md</w:t>
+      </w:r>
+      <w:r>
+        <w:t xml:space="preserve"> </w:t>
+      </w:r>
+      <w:r>
+        <w:t xml:space="preserve">§11.4.99.</w:t>
+      </w:r>
+    </w:p>
     <w:bookmarkEnd w:id="32"/>
     <w:bookmarkEnd w:id="33"/>
+    <w:bookmarkEnd w:id="34"/>
     <w:sectPr>
       <w:footnotePr>
         <w:numRestart w:val="eachSect"/>

</xml_diff>